<commit_message>
Add replicated IBM QPU campaign and finalize CCE package
</commit_message>
<xml_diff>
--- a/manuscript/PSA_QAE_CCE_SUBMISSION_MANUSCRIPT.docx
+++ b/manuscript/PSA_QAE_CCE_SUBMISSION_MANUSCRIPT.docx
@@ -60,7 +60,7 @@
           <w:color w:val="000000"/>
           <w:sz w:val="21"/>
         </w:rPr>
-        <w:t>Quantum amplitude estimation (QAE) offers a nominal query advantage for chance-constrained process optimization, but state preparation, reversible evaluation, hardware noise, and strong classical estimators can remove it. We compare Monte Carlo (MC), randomized Sobol quasi-Monte Carlo (RQMC), importance sampling, and maximum-likelihood amplitude estimation (MLAE) on a frozen purity/recovery event from a 32-run cyclic pressure swing adsorption model. At recycle fractions 0.420, 0.427, and 0.430, reference probabilities are 0.92743, 0.47044, and 0.28360. RMSE is 0.00679 for MC, 0.00248 for RQMC, 0.01017 for importance sampling, and 0.00289 for noiseless MLAE. MLAE improves on MC but not RQMC; the nearest failed policy is 11.91 RQMC RMSE from feasibility. Stream-to-event logic requires 510 qubits and 1.286 million CX. Five controller-coupled paths generate composition, pressure, two faces, a run-affinity Langmuir response, LDF uptake, and one component balance directly from raw gas inventories at 2,696–2,885 qubits and 55.34–56.29 million CX. An 845-qubit two-pressure tank circuit preserves 128 physically generated unsaturated, zero-makeup calls in a declared short-schedule control; this is not the frozen policy. On ibm_marrakesh, a three-qubit event gives unmitigated MLAE 0.56694 for exact 0.625. Process discrepancy exceeds the QAE precision target, and no screened public source supplies synchronized H₂ data for the same policy and event. This PSA regime favors RQMC. QAE requires a validated oracle, repeated reuse, structured loading, and tolerable reversible overhead.</w:t>
+        <w:t>Quantum amplitude estimation (QAE) offers a nominal query advantage for chance-constrained process optimization, but state preparation, reversible evaluation, hardware noise, and strong classical estimators can remove it. We compare Monte Carlo (MC), randomized Sobol quasi-Monte Carlo (RQMC), importance sampling, and maximum-likelihood amplitude estimation (MLAE) on a frozen purity/recovery event from a 32-run cyclic pressure swing adsorption model. At recycle fractions 0.420, 0.427, and 0.430, reference probabilities are 0.92743, 0.47044, and 0.28360. RMSE is 0.00679 for MC, 0.00248 for RQMC, 0.01017 for importance sampling, and 0.00289 for noiseless MLAE. MLAE improves on MC but not RQMC; the nearest failed policy is 11.91 RQMC RMSE from feasibility. Stream-to-event logic requires 510 qubits and 1.286 million CX. Five controller-coupled paths generate composition, pressure, two faces, a run-affinity Langmuir response, LDF uptake, and one component balance directly from raw gas inventories at 2,696–2,885 qubits and 55.34–56.29 million CX. An 845-qubit two-pressure tank circuit preserves 128 physically generated unsaturated, zero-makeup calls in a declared short-schedule control; this is not the frozen policy. Across nine IBM Open-plan jobs on three backends and three fixed transpiler seeds, a three-qubit event gives mean unmitigated MLAE 0.59919 with between-job SD 0.00375 for exact 0.625. Process discrepancy exceeds the QAE precision target, and no screened public source supplies synchronized H₂ data for the same policy and event. This PSA regime favors RQMC. QAE requires a validated oracle, repeated reuse, structured loading, and tolerable reversible overhead.</w:t>
       </w:r>
     </w:p>
     <w:p>
@@ -355,7 +355,7 @@
           <w:color w:val="000000"/>
           <w:sz w:val="21"/>
         </w:rPr>
-        <w:t>Table 4 condenses eight claim-critical tiers covering the response model, physical CSS horizon, integrated event oracle, gas-inventory-to-dynamic-Langmuir state update, pressure-derived tank allocation, external controls, and QPU kernel. The complete 31-tier hierarchy is Supplementary Table S2 and remains machine-readable; the tiers are not pooled as replicates of one plant.</w:t>
+        <w:t>Table 4 condenses eight claim-critical tiers covering the response model, physical CSS horizon, integrated event oracle, gas-inventory-to-dynamic-Langmuir state update, pressure-derived tank allocation, external controls, and QPU kernel. The complete 32-tier hierarchy is Supplementary Table S2 and remains machine-readable; the tiers are not pooled as replicates of one plant.</w:t>
       </w:r>
     </w:p>
     <w:p>
@@ -1430,7 +1430,7 @@
           <w:color w:val="000000"/>
           <w:sz w:val="21"/>
         </w:rPr>
-        <w:t>The hardware tier uses a separate eight-state process-linked event with exact p=5/8. The minimized three-qubit phase predicate is inserted into the same Grover construction used by the likelihood model. Circuits are transpiled to a named backend with a recorded seed, physical layout, depth, and two-qubit-gate count. Each circuit receives 4,096 shots in the completed reference job. Raw bitstrings, runtime metrics, calibration timestamp, and the submitted circuit metadata are archived before fitting the likelihood.</w:t>
+        <w:t>The hardware tier uses a separate eight-state process-linked event with exact p=5/8. The minimized three-qubit phase predicate is inserted into the same Grover construction used by the likelihood model. Circuits are transpiled to a named backend with a recorded seed, physical layout, depth, and two-qubit-gate count. Each of nine jobs receives 4,096 shots for every Grover power. Raw bitstrings, runtime metrics, calibration timestamp, and submitted-circuit metadata are archived before fitting the likelihood.</w:t>
       </w:r>
     </w:p>
     <w:p>
@@ -1445,7 +1445,7 @@
           <w:color w:val="000000"/>
           <w:sz w:val="21"/>
         </w:rPr>
-        <w:t>Only the IBM instance verified as plan open is permitted by the submission script. Local simulation and dry-run transpilation are separate commands. Retrieving an existing job does not submit a workload. A prepared replication matrix covers three backends and three transpiler seeds, but it remains outside the primary evidence until job identifiers and results exist.</w:t>
+        <w:t>Only the IBM instance verified as plan open is permitted by the submission script. Local simulation and dry-run transpilation are separate commands. Retrieving an existing job does not submit a workload. The completed crossed matrix covers three backends and three fixed transpiler seeds. Job-level estimates are retained separately, and the design bootstrap resamples the observed backend and seed levels without claiming coverage of other devices or calibration times.</w:t>
       </w:r>
     </w:p>
     <w:p>
@@ -1715,7 +1715,7 @@
           <w:color w:val="000000"/>
           <w:sz w:val="21"/>
         </w:rPr>
-        <w:t>The Open-plan hardware experiment ran on the 156-qubit ibm_marrakesh processor on 9 October 2026 (job db42v34lf4us73c24q50). The three circuits used Grover powers m=[0,1,2] with 4,096 shots each. Their transpiled depths were 4, 73, and 141, with 0, 19, and 39 two-qubit gates, respectively. The measured good-state frequencies were 0.624756, 0.406006, and 0.854004, compared with ideal amplified probabilities 0.625000, 0.156250, and 0.976563. The resulting unmitigated MLAE estimate was 0.566940, giving an absolute error of 0.058060 relative to p=0.625. The ideal-model likelihood interval [0.564320,0.569545] excludes the exact value and is therefore evidence of hardware-model misspecification rather than a valid uncertainty interval for the noisy estimate. The job consumed 5 s of charged QPU time (0.0829 resource units). The shallow m=0 circuit retained the original event probability, whereas the amplified circuits accumulated sufficient coherent and stochastic error to bias the joint likelihood fit. Raw bitstring counts, physical layouts, calibration time, and runtime metrics are archived with the result package.</w:t>
+        <w:t>An earlier 9 October 2026 pilot on the 156-qubit ibm_marrakesh processor (job db42v34lf4us73c24q50) used Grover powers m=[0,1,2] and 4,096 shots per circuit. Depths were 4, 73, and 141, with 0, 19, and 39 two-qubit gates. Measured good-state frequencies 0.624756/0.406006/0.854004, versus ideal 0.625000/0.156250/0.976563, gave unmitigated MLAE 0.566940 and absolute error 0.058060. Its ideal-model interval [0.564320,0.569545] excludes the exact value, demonstrating hardware-model misspecification. The job charged 5 QPU seconds; raw counts, layouts, calibration time, and runtime metrics are archived.</w:t>
       </w:r>
     </w:p>
     <w:p>
@@ -1730,7 +1730,22 @@
           <w:color w:val="000000"/>
           <w:sz w:val="21"/>
         </w:rPr>
-        <w:t>Figure 5 compares the ideal and observed amplified probabilities and the corresponding ideal-likelihood profiles. The separation between the exact probability and the hardware likelihood maximum is presented as bias evidence, not as a calibrated confidence interval.</w:t>
+        <w:t>A crossed campaign repeated the kernel over ibm_marrakesh, ibm_fez, and ibm_kingston with seeds 20261009–20261011. All nine jobs completed for 45 QPU seconds. Estimates ranged from 0.590625 to 0.603845; the mean was 0.599193, mean absolute error 0.025807, and between-job SD 0.003747. Backend- and seed-mean ranges were 0.005845 and 0.003682; the unreplicated interaction/job-noise RMSE was 0.002108. The crossed bootstrap interval [0.595136,0.602318] describes only the sampled backend/seed levels, not other processors or calibration times. The pilot is not pooled as a tenth replicate.</w:t>
+      </w:r>
+    </w:p>
+    <w:p>
+      <w:pPr>
+        <w:ind w:firstLine="288"/>
+      </w:pPr>
+      <w:r>
+        <w:rPr>
+          <w:rFonts w:ascii="Times New Roman" w:hAnsi="Times New Roman"/>
+          <w:b w:val="0"/>
+          <w:i w:val="0"/>
+          <w:color w:val="000000"/>
+          <w:sz w:val="21"/>
+        </w:rPr>
+        <w:t>Figure 5 shows the nine job-level estimates, the power-specific amplification distortion, and absolute errors. All campaign estimates remain below the exact probability, so replication narrows the empirical hardware boundary without making the ideal-model likelihood interval valid for the noisy devices.</w:t>
       </w:r>
     </w:p>
     <w:p>
@@ -2120,7 +2135,7 @@
           <w:color w:val="000000"/>
           <w:sz w:val="21"/>
         </w:rPr>
-        <w:t>Figure 4 assembles the measured resource ladder: the resolution that fixes the response-event oracle, the low-bit dense-loader boundary, the joint input/output precision screen for the calibrated phase maps, and the compiled CX cost of their affine variable terms. Table 3 condenses eight decision-relevant resource tiers while preserving separate per-call, schedule-level, simulated, preflight, and real-QPU columns. The complete 30-tier ladder is Supplementary Table S1, preventing resources from different tiers from being added as if they described one completed circuit.</w:t>
+        <w:t>Figure 4 assembles the measured resource ladder: the resolution that fixes the response-event oracle, the low-bit dense-loader boundary, the joint input/output precision screen for the calibrated phase maps, and the compiled CX cost of their affine variable terms. Table 3 condenses eight decision-relevant resource tiers while preserving separate per-call, schedule-level, simulated, preflight, and real-QPU columns. The complete 31-tier ladder is Supplementary Table S1, preventing resources from different tiers from being added as if they described one completed circuit.</w:t>
       </w:r>
     </w:p>
     <w:p>
@@ -2710,7 +2725,7 @@
           <w:color w:val="000000"/>
           <w:sz w:val="21"/>
         </w:rPr>
-        <w:t>The real-QPU tier tests executable compilation and noise sensitivity. Its eight-state discretization is intentionally too small to establish computational advantage. Its value is to connect the process event, reversible logic, transpiled circuit, and observed hardware statistics without replacing the larger end-to-end resource analysis. The observed divergence between the nearly unbiased m=0 frequency and the biased amplified likelihood also shows why deeper amplitude-amplification circuits require an explicit noise model or mitigation strategy; increasing the query power alone does not improve the engineering probability estimate on the tested hardware.</w:t>
+        <w:t>The real-QPU tier connects reversible event logic, transpilation, and hardware statistics. Its eight-state discretization cannot establish computational advantage. Divergence between the nearly unbiased m=0 frequency and biased amplified likelihood shows that deeper powers require an explicit noise model or mitigation strategy.</w:t>
       </w:r>
     </w:p>
     <w:p>
@@ -2800,7 +2815,7 @@
           <w:color w:val="000000"/>
           <w:sz w:val="21"/>
         </w:rPr>
-        <w:t>The completed QPU evidence is one job on one backend. The ideal-model likelihood interval excludes the exact probability because hardware bias is not represented in the likelihood. This interval cannot be interpreted as a calibrated confidence interval for the noisy device. Multi-backend repeated execution, execution-time calibration records, readout mitigation, and a run-level overdispersion or bootstrap analysis remain necessary for a hardware-general statement.</w:t>
+        <w:t>The nine-job campaign retains raw counts, calibration timestamps, layouts, circuit resources, and charge per job. Its crossed bootstrap is limited to the sampled backend/seed levels, while ideal-model intervals omit hardware bias. Because the campaign spans one short calibration window, readout mitigation, repetition across calibration times, and broader device coverage remain necessary for a hardware-general statement.</w:t>
       </w:r>
     </w:p>
     <w:p>
@@ -2905,7 +2920,7 @@
           <w:color w:val="000000"/>
           <w:sz w:val="21"/>
         </w:rPr>
-        <w:t>The paper cannot support industrial performance, a global recycle optimum, or realized speedup. The process ledgers, raw-gas-inventory state updates, pressure-derived tank-allocation arithmetic, and one model-derived short-schedule unsaturated trajectory narrow the process-to-oracle gap. Frozen-schedule unsaturated coverage, adaptive integration, routing, and a monolithic phase/cycle remain open. Stronger claims require a calibrated same-policy H₂ event result, complete cycle logic, a scalable correlated loader, and repeated noise-aware hardware results.</w:t>
+        <w:t>The paper cannot support industrial performance, a global recycle optimum, or realized speedup. The process ledgers, raw-gas-inventory state updates, pressure-derived tank-allocation arithmetic, and one model-derived short-schedule unsaturated trajectory narrow the process-to-oracle gap. Frozen-schedule unsaturated coverage, adaptive integration, routing, and a monolithic phase/cycle remain open. Stronger process claims require a calibrated same-policy H₂ event result, complete cycle logic, and a scalable correlated loader; hardware-general claims would additionally require mitigation and repetition across calibration times and devices.</w:t>
       </w:r>
     </w:p>
     <w:p>
@@ -2935,7 +2950,7 @@
           <w:color w:val="000000"/>
           <w:sz w:val="21"/>
         </w:rPr>
-        <w:t>QAE improves on crude MC but not Sobol-QMC. Physical runs settle by cycle 68, and 16-bit quantization gives an 85-cycle, 2,880-qubit register point. Raw-inventory component paths require 2,696–2,885 qubits and 55.34–56.29 million CX. An 845-qubit tank circuit preserves 128 physically generated unsaturated calls in a short-schedule control, while the 510-qubit policy oracle retains every frozen label. Monolithic phase integration, frozen-schedule unsaturated coverage, structured loading, H₂ validation, and repeated hardware evidence remain open.</w:t>
+        <w:t>QAE improves on crude MC but not Sobol-QMC. Physical runs settle by cycle 68, and 16-bit quantization gives an 85-cycle, 2,880-qubit register point. Raw-inventory component paths require 2,696–2,885 qubits and 55.34–56.29 million CX. An 845-qubit tank circuit preserves 128 physically generated unsaturated calls in a short-schedule control, while the 510-qubit policy oracle retains every frozen label. The nine-job crossed IBM campaign gives mean estimate 0.599193 and between-job SD 0.003747 for exact 0.625 over three backends and three seeds. Monolithic phase integration, frozen-schedule unsaturated coverage, structured loading, and same-policy H₂ validation remain open.</w:t>
       </w:r>
     </w:p>
     <w:p>
@@ -6651,7 +6666,7 @@
           <w:color w:val="000000"/>
           <w:sz w:val="16"/>
         </w:rPr>
-        <w:t>Main-text summary of 8/30 tiers; the complete table is reproduced as Supplementary Table S1 and archived as CSV/JSON/Markdown.</w:t>
+        <w:t>Main-text summary of 8/31 tiers; the complete table is reproduced as Supplementary Table S1 and archived as CSV/JSON/Markdown.</w:t>
       </w:r>
     </w:p>
     <w:tbl>
@@ -9260,7 +9275,7 @@
           <w:color w:val="000000"/>
           <w:sz w:val="16"/>
         </w:rPr>
-        <w:t>Main-text summary of 8/31 tiers; the complete table is reproduced as Supplementary Table S2 and archived as CSV/JSON/Markdown.</w:t>
+        <w:t>Main-text summary of 8/32 tiers; the complete table is reproduced as Supplementary Table S2 and archived as CSV/JSON/Markdown.</w:t>
       </w:r>
     </w:p>
     <w:tbl>
@@ -11459,8 +11474,8 @@
       <w:r>
         <w:drawing>
           <wp:inline xmlns:a="http://schemas.openxmlformats.org/drawingml/2006/main" xmlns:pic="http://schemas.openxmlformats.org/drawingml/2006/picture">
-            <wp:extent cx="5897880" cy="2661432"/>
-            <wp:docPr id="5" name="Picture 5" descr="Figure 5. Real-QPU amplification-noise boundary on `ibm_marrakesh`. (a) Ideal and observed good-state probabilities for Grover powers 0, 1, and 2 with 4,096 shots per circuit. Error bars show shot uncertainty only. (b) Ideal-model likelihood profile evaluated on the hardware counts; the exact probability 0.625 and the unmitigated maximum-likelihood estimate 0.56694 are separated by hardware-model bias. The ideal likelihood interval is not a noise-calibrated confidence interval."/>
+            <wp:extent cx="5897880" cy="1876598"/>
+            <wp:docPr id="5" name="Picture 5" descr="Figure 5. Crossed real-QPU amplification-noise boundary. Nine Open-plan jobs repeat the frozen three-qubit event over `ibm_marrakesh`, `ibm_fez`, and `ibm_kingston` with three fixed transpiler seeds and 4,096 shots per Grover power. (a) Job-level MLAE estimates relative to the exact probability 0.625. (b) Observed good-state probabilities for powers 0, 1, and 2; crosses show the ideal amplified probabilities. (c) Job-level absolute errors. The crossed backend/seed bootstrap interval describes only the sampled design and is not a universal noise-calibrated confidence interval."/>
             <wp:cNvGraphicFramePr>
               <a:graphicFrameLocks noChangeAspect="1"/>
             </wp:cNvGraphicFramePr>
@@ -11468,7 +11483,7 @@
               <a:graphicData uri="http://schemas.openxmlformats.org/drawingml/2006/picture">
                 <pic:pic>
                   <pic:nvPicPr>
-                    <pic:cNvPr id="0" name="FIG_QPU_MLAE_HARDWARE_BOUNDARY.png"/>
+                    <pic:cNvPr id="0" name="PSA_QAE_QPU_REPLICATION_CAMPAIGN_ANALYSIS_FIGURE.png"/>
                     <pic:cNvPicPr/>
                   </pic:nvPicPr>
                   <pic:blipFill>
@@ -11480,7 +11495,7 @@
                   <pic:spPr>
                     <a:xfrm>
                       <a:off x="0" y="0"/>
-                      <a:ext cx="5897880" cy="2661432"/>
+                      <a:ext cx="5897880" cy="1876598"/>
                     </a:xfrm>
                     <a:prstGeom prst="rect"/>
                   </pic:spPr>
@@ -11504,7 +11519,7 @@
           <w:color w:val="000000"/>
           <w:sz w:val="18"/>
         </w:rPr>
-        <w:t>Figure 5. Real-QPU amplification-noise boundary on ibm_marrakesh. (a) Ideal and observed good-state probabilities for Grover powers 0, 1, and 2 with 4,096 shots per circuit. Error bars show shot uncertainty only. (b) Ideal-model likelihood profile evaluated on the hardware counts; the exact probability 0.625 and the unmitigated maximum-likelihood estimate 0.56694 are separated by hardware-model bias. The ideal likelihood interval is not a noise-calibrated confidence interval.</w:t>
+        <w:t>Figure 5. Crossed real-QPU amplification-noise boundary. Nine Open-plan jobs repeat the frozen three-qubit event over ibm_marrakesh, ibm_fez, and ibm_kingston with three fixed transpiler seeds and 4,096 shots per Grover power. (a) Job-level MLAE estimates relative to the exact probability 0.625. (b) Observed good-state probabilities for powers 0, 1, and 2; crosses show the ideal amplified probabilities. (c) Job-level absolute errors. The crossed backend/seed bootstrap interval describes only the sampled design and is not a universal noise-calibrated confidence interval.</w:t>
       </w:r>
     </w:p>
     <w:p>

</xml_diff>